<commit_message>
Add numbered evidence citations to manuscript
</commit_message>
<xml_diff>
--- a/manuscript/submission/terpene-structure-function-claims.docx
+++ b/manuscript/submission/terpene-structure-function-claims.docx
@@ -1111,13 +1111,13 @@
     <w:p>
       <w:pPr/>
       <w:r>
-        <w:t>binding and functional agonism at CB2, and CB2-dependent analgesic effects have</w:t>
+        <w:t>binding and functional agonism at CB2 [1], and CB2-dependent analgesic effects</w:t>
       </w:r>
     </w:p>
     <w:p>
       <w:pPr/>
       <w:r>
-        <w:t>been reported in mouse models. These results support a testable CB2-mediated</w:t>
+        <w:t>have been reported in mouse models [2]. These results support a testable CB2-mediated</w:t>
       </w:r>
     </w:p>
     <w:p>
@@ -1165,24 +1165,42 @@
     <w:p>
       <w:pPr/>
       <w:r>
-        <w:t>than a direct biophysical binding assay. Linalool enhanced GABA-A currents in</w:t>
+        <w:t>than a direct biophysical binding assay [3]. Linalool enhanced GABA-A currents</w:t>
       </w:r>
     </w:p>
     <w:p>
       <w:pPr/>
       <w:r>
-        <w:t>recombinant systems, and borneol modulated human recombinant α1β2γ2L GABA-A</w:t>
+        <w:t>in recombinant systems [4] and altered respiratory-neuron activity in a rat</w:t>
       </w:r>
     </w:p>
     <w:p>
       <w:pPr/>
       <w:r>
-        <w:t>receptors. These findings make sedation, anxiety, and nociception useful</w:t>
+        <w:t>brainstem preparation [11], while borneol modulated human recombinant</w:t>
       </w:r>
     </w:p>
     <w:p>
       <w:pPr/>
       <w:r>
+        <w:t>α1β2γ2L GABA-A receptors [5] and produced bounded mouse hyperalgesia and</w:t>
+      </w:r>
+    </w:p>
+    <w:p>
+      <w:pPr/>
+      <w:r>
+        <w:t>anxiety-related phenotypes in separate studies [9,10]. These findings make</w:t>
+      </w:r>
+    </w:p>
+    <w:p>
+      <w:pPr/>
+      <w:r>
+        <w:t>sedation, anxiety, and nociception useful</w:t>
+      </w:r>
+    </w:p>
+    <w:p>
+      <w:pPr/>
+      <w:r>
         <w:t>follow-up domains, not established human effects.</w:t>
       </w:r>
     </w:p>
@@ -1195,7 +1213,7 @@
     <w:p>
       <w:pPr/>
       <w:r>
-        <w:t>α7 nicotinic acetylcholine receptor and antagonist-sensitive behavioral</w:t>
+        <w:t>α7 nicotinic acetylcholine receptor [6] and antagonist-sensitive behavioral</w:t>
       </w:r>
     </w:p>
     <w:p>
@@ -1219,7 +1237,7 @@
     <w:p>
       <w:pPr/>
       <w:r>
-        <w:t>expression experiments, not native human pain studies. The related nanoparticle</w:t>
+        <w:t>expression experiments, not native human pain studies [7]. The related nanoparticle</w:t>
       </w:r>
     </w:p>
     <w:p>
@@ -1231,19 +1249,19 @@
     <w:p>
       <w:pPr/>
       <w:r>
-        <w:t>pharmacology. Terpineol</w:t>
+        <w:t>pharmacology [13]. Terpineol is a weaker CB1/CB2/D2 hypothesis because its current</w:t>
       </w:r>
     </w:p>
     <w:p>
       <w:pPr/>
       <w:r>
-        <w:t>is a weaker CB1/CB2/D2 hypothesis because its current support comes from mouse</w:t>
+        <w:t>support comes from mouse antagonist experiments and docking rather than direct</w:t>
       </w:r>
     </w:p>
     <w:p>
       <w:pPr/>
       <w:r>
-        <w:t>antagonist experiments and docking rather than direct receptor binding.</w:t>
+        <w:t>receptor binding [8].</w:t>
       </w:r>
     </w:p>
     <w:p>
@@ -1281,7 +1299,7 @@
     <w:p>
       <w:pPr/>
       <w:r>
-        <w:t>phenotype, while one study did not support a GABA-A potentiation mechanism;</w:t>
+        <w:t>phenotype [12], while one study did not support a GABA-A potentiation mechanism;</w:t>
       </w:r>
     </w:p>
     <w:p>

</xml_diff>

<commit_message>
Publish public repository URL in submission package
</commit_message>
<xml_diff>
--- a/manuscript/submission/terpene-structure-function-claims.docx
+++ b/manuscript/submission/terpene-structure-function-claims.docx
@@ -2224,6 +2224,18 @@
       </w:r>
     </w:p>
     <w:p>
+      <w:pPr/>
+      <w:r>
+        <w:t>The versioned public repository for the data products and build scripts is</w:t>
+      </w:r>
+    </w:p>
+    <w:p>
+      <w:pPr/>
+      <w:r>
+        <w:t>https://github.com/Terpedia/claims.</w:t>
+      </w:r>
+    </w:p>
+    <w:p>
       <w:pPr>
         <w:pStyle w:val="ListBullet"/>
       </w:pPr>

</xml_diff>

<commit_message>
Format manuscript for PR&P submission
</commit_message>
<xml_diff>
--- a/manuscript/submission/terpene-structure-function-claims.docx
+++ b/manuscript/submission/terpene-structure-function-claims.docx
@@ -17,7 +17,7 @@
         <w:jc w:val="center"/>
       </w:pPr>
       <w:r>
-        <w:t>Perspective manuscript</w:t>
+        <w:t>Review article | evidence-based pharmacological perspective</w:t>
       </w:r>
     </w:p>
     <w:p>
@@ -56,6 +56,33 @@
         <w:t>Running title: Terpene receptor hypotheses</w:t>
       </w:r>
     </w:p>
+    <w:p>
+      <w:pPr>
+        <w:spacing w:after="40"/>
+        <w:jc w:val="center"/>
+      </w:pPr>
+      <w:r>
+        <w:t>Text pages: 11 | Tables: 1 | Figures: 0 | References: 13</w:t>
+      </w:r>
+    </w:p>
+    <w:p>
+      <w:pPr>
+        <w:spacing w:after="40"/>
+        <w:jc w:val="center"/>
+      </w:pPr>
+      <w:r>
+        <w:t>Abstract: 153 words | Introduction: 118 words | Discussion: 1,009 words</w:t>
+      </w:r>
+    </w:p>
+    <w:p>
+      <w:pPr>
+        <w:spacing w:after="40"/>
+        <w:jc w:val="center"/>
+      </w:pPr>
+      <w:r>
+        <w:t>Abbreviations: CB1, CB2, D2, E0–E4, GABA-A, nAChR, TRPV1</w:t>
+      </w:r>
+    </w:p>
     <w:p/>
     <w:p>
       <w:r>
@@ -511,7 +538,16 @@
     <w:p>
       <w:pPr/>
       <w:r>
-        <w:t>matrix:</w:t>
+        <w:t>matrix; the permitted conclusions are summarized in Table 1:</w:t>
+      </w:r>
+    </w:p>
+    <w:p>
+      <w:pPr/>
+      <w:r>
+        <w:rPr>
+          <w:b/>
+        </w:rPr>
+        <w:t>Table 1. Evidence ladder for compound–target interpretation.</w:t>
       </w:r>
     </w:p>
     <w:tbl>
@@ -1021,6 +1057,18 @@
     <w:p>
       <w:pPr/>
       <w:r>
+        <w:rPr>
+          <w:i/>
+        </w:rPr>
+        <w:t>Abbreviations:</w:t>
+      </w:r>
+      <w:r>
+        <w:t xml:space="preserve"> E0–E4, evidence ladder levels 0 through 4.</w:t>
+      </w:r>
+    </w:p>
+    <w:p>
+      <w:pPr/>
+      <w:r>
         <w:t>The current manuscript reports E3/E4 compound-level evidence separately from</w:t>
       </w:r>
     </w:p>
@@ -1079,7 +1127,19 @@
     <w:p>
       <w:pPr/>
       <w:r>
-        <w:t>All 109 retained an `effect_support_status` of `unresolved`, because the map</w:t>
+        <w:t xml:space="preserve">All 109 retained an </w:t>
+      </w:r>
+      <w:r>
+        <w:t>effect_support_status</w:t>
+      </w:r>
+      <w:r>
+        <w:t xml:space="preserve"> of </w:t>
+      </w:r>
+      <w:r>
+        <w:t>unresolved</w:t>
+      </w:r>
+      <w:r>
+        <w:t>, because the map</w:t>
       </w:r>
     </w:p>
     <w:p>
@@ -1171,31 +1231,19 @@
     <w:p>
       <w:pPr/>
       <w:r>
-        <w:t>in recombinant systems [4] and altered respiratory-neuron activity in a rat</w:t>
-      </w:r>
-    </w:p>
-    <w:p>
-      <w:pPr/>
-      <w:r>
-        <w:t>brainstem preparation [11], while borneol modulated human recombinant</w:t>
-      </w:r>
-    </w:p>
-    <w:p>
-      <w:pPr/>
-      <w:r>
-        <w:t>α1β2γ2L GABA-A receptors [5] and produced bounded mouse hyperalgesia and</w:t>
-      </w:r>
-    </w:p>
-    <w:p>
-      <w:pPr/>
-      <w:r>
-        <w:t>anxiety-related phenotypes in separate studies [9,10]. These findings make</w:t>
-      </w:r>
-    </w:p>
-    <w:p>
-      <w:pPr/>
-      <w:r>
-        <w:t>sedation, anxiety, and nociception useful</w:t>
+        <w:t>in recombinant systems [4], while borneol modulated human recombinant</w:t>
+      </w:r>
+    </w:p>
+    <w:p>
+      <w:pPr/>
+      <w:r>
+        <w:t>α1β2γ2L GABA-A receptors [5]. These findings make sedation, anxiety, and</w:t>
+      </w:r>
+    </w:p>
+    <w:p>
+      <w:pPr/>
+      <w:r>
+        <w:t>nociception useful</w:t>
       </w:r>
     </w:p>
     <w:p>
@@ -1249,7 +1297,7 @@
     <w:p>
       <w:pPr/>
       <w:r>
-        <w:t>pharmacology [13]. Terpineol is a weaker CB1/CB2/D2 hypothesis because its current</w:t>
+        <w:t>pharmacology. Terpineol is a weaker CB1/CB2/D2 hypothesis because its current</w:t>
       </w:r>
     </w:p>
     <w:p>
@@ -1261,7 +1309,19 @@
     <w:p>
       <w:pPr/>
       <w:r>
-        <w:t>receptor binding [8].</w:t>
+        <w:t>receptor binding [8]. Separate mouse studies of borneol reported bounded</w:t>
+      </w:r>
+    </w:p>
+    <w:p>
+      <w:pPr/>
+      <w:r>
+        <w:t>hyperalgesia and anxiety-related phenotypes [9,10], and linalool altered</w:t>
+      </w:r>
+    </w:p>
+    <w:p>
+      <w:pPr/>
+      <w:r>
+        <w:t>respiratory-neuron activity in a rat brainstem preparation [11].</w:t>
       </w:r>
     </w:p>
     <w:p>
@@ -1306,6 +1366,18 @@
       <w:pPr/>
       <w:r>
         <w:t>the target therefore remains unresolved.</w:t>
+      </w:r>
+    </w:p>
+    <w:p>
+      <w:pPr/>
+      <w:r>
+        <w:t>The formulation-specific nanoparticle evidence does not establish free-terpene</w:t>
+      </w:r>
+    </w:p>
+    <w:p>
+      <w:pPr/>
+      <w:r>
+        <w:t>pharmacology [13].</w:t>
       </w:r>
     </w:p>
     <w:p>
@@ -2236,6 +2308,36 @@
       </w:r>
     </w:p>
     <w:p>
+      <w:pPr/>
+      <w:r>
+        <w:t>Supporting Information Tables S1–S4 provide the machine-readable claims–terpene</w:t>
+      </w:r>
+    </w:p>
+    <w:p>
+      <w:pPr/>
+      <w:r>
+        <w:t>matrix, receptor hypothesis map, prioritized hypotheses-to-test table, and</w:t>
+      </w:r>
+    </w:p>
+    <w:p>
+      <w:pPr/>
+      <w:r>
+        <w:t>derived hypothesis register, respectively. These files are supplied with the</w:t>
+      </w:r>
+    </w:p>
+    <w:p>
+      <w:pPr/>
+      <w:r>
+        <w:t>submission and preserve row-level provenance; they are not independent claims</w:t>
+      </w:r>
+    </w:p>
+    <w:p>
+      <w:pPr/>
+      <w:r>
+        <w:t>of efficacy.</w:t>
+      </w:r>
+    </w:p>
+    <w:p>
       <w:pPr>
         <w:pStyle w:val="ListBullet"/>
       </w:pPr>
@@ -2344,7 +2446,7 @@
         <w:rPr>
           <w:i/>
         </w:rPr>
-        <w:t>Proceedings of the National Academy of Sciences</w:t>
+        <w:t>Proc Natl Acad Sci U S A</w:t>
       </w:r>
       <w:r>
         <w:t xml:space="preserve">. 2008;105(26):9099–9104. </w:t>
@@ -2369,7 +2471,7 @@
         <w:rPr>
           <w:i/>
         </w:rPr>
-        <w:t>European Neuropsychopharmacology</w:t>
+        <w:t>Eur Neuropsychopharmacol</w:t>
       </w:r>
       <w:r>
         <w:t xml:space="preserve">. 2014;24(4):608–620. </w:t>
@@ -2394,7 +2496,7 @@
         <w:rPr>
           <w:i/>
         </w:rPr>
-        <w:t>Molecular Pharmacology</w:t>
+        <w:t>Mol Pharmacol</w:t>
       </w:r>
       <w:r>
         <w:t xml:space="preserve">. 2016;90(5):530–539. </w:t>
@@ -2419,7 +2521,7 @@
         <w:rPr>
           <w:i/>
         </w:rPr>
-        <w:t>Frontiers in Chemistry</w:t>
+        <w:t>Front Chem</w:t>
       </w:r>
       <w:r>
         <w:t xml:space="preserve">. 2017;5:46. </w:t>
@@ -2444,7 +2546,7 @@
         <w:rPr>
           <w:i/>
         </w:rPr>
-        <w:t>Biochemical Pharmacology</w:t>
+        <w:t>Biochem Pharmacol</w:t>
       </w:r>
       <w:r>
         <w:t xml:space="preserve">. 2005;69(7):1101–1111. </w:t>
@@ -2494,7 +2596,7 @@
         <w:rPr>
           <w:i/>
         </w:rPr>
-        <w:t>Channels</w:t>
+        <w:t>Channels (Austin)</w:t>
       </w:r>
       <w:r>
         <w:t xml:space="preserve">. 2019;13(1):344–366. </w:t>
@@ -2544,7 +2646,7 @@
         <w:rPr>
           <w:i/>
         </w:rPr>
-        <w:t>European Journal of Pharmacology</w:t>
+        <w:t>Eur J Pharmacol</w:t>
       </w:r>
       <w:r>
         <w:t xml:space="preserve">. 2015;757:53–58. </w:t>
@@ -2569,7 +2671,7 @@
         <w:rPr>
           <w:i/>
         </w:rPr>
-        <w:t>Biochemical and Biophysical Research Communications</w:t>
+        <w:t>Biochem Biophys Res Commun</w:t>
       </w:r>
       <w:r>
         <w:t xml:space="preserve">. 2018;495(2):1588–1593. </w:t>
@@ -2594,7 +2696,7 @@
         <w:rPr>
           <w:i/>
         </w:rPr>
-        <w:t>Biomedical Research</w:t>
+        <w:t>Biomed Res</w:t>
       </w:r>
       <w:r>
         <w:t xml:space="preserve">. 2024;45(4):151–161. </w:t>
@@ -2619,7 +2721,7 @@
         <w:rPr>
           <w:i/>
         </w:rPr>
-        <w:t>Pharmaceuticals</w:t>
+        <w:t>Pharmaceuticals (Basel)</w:t>
       </w:r>
       <w:r>
         <w:t xml:space="preserve">. 2021;14(7):651. </w:t>
@@ -2644,7 +2746,7 @@
         <w:rPr>
           <w:i/>
         </w:rPr>
-        <w:t>International Journal of Pharmaceutics</w:t>
+        <w:t>Int J Pharm</w:t>
       </w:r>
       <w:r>
         <w:t xml:space="preserve">. 2022;616:121524. </w:t>

</xml_diff>

<commit_message>
Complete PR&P journal format audit updates
</commit_message>
<xml_diff>
--- a/manuscript/submission/terpene-structure-function-claims.docx
+++ b/manuscript/submission/terpene-structure-function-claims.docx
@@ -2431,6 +2431,32 @@
     </w:p>
     <w:p>
       <w:pPr>
+        <w:pStyle w:val="Heading2"/>
+      </w:pPr>
+      <w:r>
+        <w:t>8.1 Acknowledgements</w:t>
+      </w:r>
+    </w:p>
+    <w:p>
+      <w:pPr/>
+      <w:r>
+        <w:t>The authors thank the Terpedia project contributors and maintainers of the</w:t>
+      </w:r>
+    </w:p>
+    <w:p>
+      <w:pPr/>
+      <w:r>
+        <w:t>source databases and public literature services used in this work. No specific</w:t>
+      </w:r>
+    </w:p>
+    <w:p>
+      <w:pPr/>
+      <w:r>
+        <w:t>funding was received for this work.</w:t>
+      </w:r>
+    </w:p>
+    <w:p>
+      <w:pPr>
         <w:pStyle w:val="Heading1"/>
       </w:pPr>
       <w:r>

</xml_diff>